<commit_message>
fixed bugs with deploy script
</commit_message>
<xml_diff>
--- a/Claude outputs/Week 08 - CI-CD Foundations (GitHub Actions) Lab Guide.docx
+++ b/Claude outputs/Week 08 - CI-CD Foundations (GitHub Actions) Lab Guide.docx
@@ -5392,7 +5392,7 @@
           <w:i w:val="0"/>
           <w:sz w:val="22"/>
         </w:rPr>
-        <w:t>Delete the downloaded zip from your laptop; GitHub keeps the artifacts attached to the run for you. Keep build.yml — in the next lab the deploy job takes these exact artifacts and ships them.</w:t>
+        <w:t>Delete the downloaded zip from your laptop; GitHub keeps the artifacts attached to the run for you. build.yml was here to teach you what a build stage and an artifact are — in the next lab the real deploy workflow builds its own artifact exactly this way and then ships it, so you can keep build.yml as a reference or delete it; nothing later depends on it.</w:t>
       </w:r>
     </w:p>
     <w:tbl>
@@ -5749,7 +5749,7 @@
               <w:rPr>
                 <w:sz w:val="20"/>
               </w:rPr>
-              <w:t>Write a deploy job that copies the artifact over, releases it, and restarts the service</w:t>
+              <w:t>Use the deploy workflow that copies the artifact over, releases it, and restarts the service</w:t>
             </w:r>
           </w:p>
         </w:tc>
@@ -6352,7 +6352,7 @@
                 <w:color w:val="1B1B1B"/>
                 <w:sz w:val="20"/>
               </w:rPr>
-              <w:t>==&gt; 1/6 Installing Node 20, Docker and Nginx</w:t>
+              <w:t>==&gt; 1/7 Installing Node 20, Docker and Nginx</w:t>
             </w:r>
           </w:p>
           <w:p>
@@ -6364,7 +6364,7 @@
                 <w:color w:val="1B1B1B"/>
                 <w:sz w:val="20"/>
               </w:rPr>
-              <w:t>==&gt; 3/6 Starting the PostgreSQL and Redis containers</w:t>
+              <w:t>==&gt; 3/7 Starting the PostgreSQL and Redis containers</w:t>
             </w:r>
           </w:p>
           <w:p>
@@ -6376,7 +6376,7 @@
                 <w:color w:val="1B1B1B"/>
                 <w:sz w:val="20"/>
               </w:rPr>
-              <w:t>==&gt; 4/6 Loading the schema and seed into the database</w:t>
+              <w:t>==&gt; 4/7 Loading the schema and seed into the database</w:t>
             </w:r>
           </w:p>
           <w:p>
@@ -6388,7 +6388,7 @@
                 <w:color w:val="1B1B1B"/>
                 <w:sz w:val="20"/>
               </w:rPr>
-              <w:t>==&gt; 6/6 Configuring Nginx</w:t>
+              <w:t>==&gt; 6/7 Configuring Nginx</w:t>
             </w:r>
           </w:p>
           <w:p>
@@ -6400,7 +6400,7 @@
                 <w:color w:val="1B1B1B"/>
                 <w:sz w:val="20"/>
               </w:rPr>
-              <w:t>Bootstrap complete.</w:t>
+              <w:t>==&gt; 7/7 Seeding the frontend so the site works before the first deploy</w:t>
             </w:r>
           </w:p>
           <w:p>
@@ -6412,7 +6412,7 @@
                 <w:color w:val="1B1B1B"/>
                 <w:sz w:val="20"/>
               </w:rPr>
-              <w:t xml:space="preserve">  data tier : postgres + redis  (Docker containers)</w:t>
+              <w:t>Bootstrap complete.</w:t>
             </w:r>
           </w:p>
           <w:p>
@@ -6424,7 +6424,19 @@
                 <w:color w:val="1B1B1B"/>
                 <w:sz w:val="20"/>
               </w:rPr>
-              <w:t xml:space="preserve">  app tier  : backend + frontend (native: systemd + Nginx)</w:t>
+              <w:t>The site is ALREADY LIVE at  http://&lt;this-instance-public-ip&gt;/  (seeded frontend).</w:t>
+            </w:r>
+          </w:p>
+          <w:p>
+            <w:pPr>
+              <w:spacing w:before="0" w:after="20" w:line="276" w:lineRule="auto"/>
+            </w:pPr>
+            <w:r>
+              <w:rPr>
+                <w:color w:val="1B1B1B"/>
+                <w:sz w:val="20"/>
+              </w:rPr>
+              <w:t>The backend starts once you deploy a release (push to main, or run the workflows).</w:t>
             </w:r>
           </w:p>
         </w:tc>
@@ -6500,12 +6512,72 @@
         </w:rPr>
       </w:r>
     </w:p>
+    <w:tbl>
+      <w:tblPr>
+        <w:tblW w:type="auto" w:w="0"/>
+        <w:tblLook w:firstColumn="1" w:firstRow="1" w:lastColumn="0" w:lastRow="0" w:noHBand="0" w:noVBand="1" w:val="04A0"/>
+      </w:tblPr>
+      <w:tblGrid>
+        <w:gridCol w:w="9648"/>
+      </w:tblGrid>
+      <w:tr>
+        <w:tc>
+          <w:tcPr>
+            <w:tcW w:type="dxa" w:w="9648"/>
+            <w:shd w:val="clear" w:color="auto" w:fill="E0F2F1"/>
+            <w:tcBorders>
+              <w:top w:val="single" w:sz="8" w:color="00695C"/>
+              <w:left w:val="single" w:sz="8" w:color="00695C"/>
+              <w:bottom w:val="single" w:sz="8" w:color="00695C"/>
+              <w:right w:val="single" w:sz="8" w:color="00695C"/>
+            </w:tcBorders>
+            <w:tcMar>
+              <w:top w:w="110" w:type="dxa"/>
+              <w:start w:w="150" w:type="dxa"/>
+              <w:bottom w:w="110" w:type="dxa"/>
+              <w:end w:w="150" w:type="dxa"/>
+            </w:tcMar>
+          </w:tcPr>
+          <w:p>
+            <w:pPr>
+              <w:spacing w:before="0" w:after="20" w:line="276" w:lineRule="auto"/>
+            </w:pPr>
+            <w:r/>
+            <w:r>
+              <w:rPr>
+                <w:b/>
+                <w:color w:val="00695C"/>
+                <w:sz w:val="20"/>
+              </w:rPr>
+              <w:t xml:space="preserve">i Info </w:t>
+            </w:r>
+            <w:r>
+              <w:rPr>
+                <w:color w:val="1B1B1B"/>
+                <w:sz w:val="20"/>
+              </w:rPr>
+              <w:t>Visit http://&lt;EC2_HOST&gt;/ now and the Paystream page loads, but the status pill reads 'API unreachable'. That is correct: the frontend is live, but the backend service does not start until your first deploy puts a release in place. The next steps are that first deploy. (If instead you ever get a 403 Forbidden, the web root is empty — re-run the bootstrap, which seeds it.)</w:t>
+            </w:r>
+          </w:p>
+        </w:tc>
+      </w:tr>
+    </w:tbl>
+    <w:p>
+      <w:pPr>
+        <w:spacing w:before="0" w:after="0"/>
+      </w:pPr>
+      <w:r>
+        <w:rPr>
+          <w:sz w:val="6"/>
+        </w:rPr>
+      </w:r>
+    </w:p>
     <w:p>
       <w:pPr>
         <w:pStyle w:val="Heading3"/>
       </w:pPr>
       <w:r>
-        <w:t>D3 — The deploy job: scp the artifact, release it, restart</w:t>
+        <w:t>D3 — The deploy workflow (it already ships with the app)</w:t>
       </w:r>
     </w:p>
     <w:p>
@@ -6515,7 +6587,7 @@
           <w:i w:val="0"/>
           <w:sz w:val="22"/>
         </w:rPr>
-        <w:t>Create .github/workflows/deploy-backend.yml. It builds the artifact (as in Lab 3), copies it to the box, and runs the remote release script the app already ships (deploy/deploy-backend-remote.sh) — the evolved deploy.sh.</w:t>
+        <w:t>A deploy pipeline is exactly the kind of thing you keep in version control and reuse, not retype by hand each time — so the app already includes it, at .github/workflows/deploy-backend.yml. Open that file and read it rather than writing it from scratch. It does, in order: check out the code, run the tests one more time as a gate, build the production zip (npm ci --omit=dev, then zip), upload the zip as a visible artifact, and then ship it. The shipping is the part to read closely:</w:t>
       </w:r>
     </w:p>
     <w:tbl>
@@ -6561,7 +6633,7 @@
                 <w:color w:val="D6E2EA"/>
                 <w:sz w:val="20"/>
               </w:rPr>
-              <w:t>name: Deploy backend</w:t>
+              <w:t>- name: Ship to EC2 and restart</w:t>
             </w:r>
           </w:p>
           <w:p>
@@ -6574,7 +6646,7 @@
                 <w:color w:val="D6E2EA"/>
                 <w:sz w:val="20"/>
               </w:rPr>
-              <w:t xml:space="preserve"> </w:t>
+              <w:t xml:space="preserve">  env:</w:t>
             </w:r>
           </w:p>
           <w:p>
@@ -6587,7 +6659,7 @@
                 <w:color w:val="D6E2EA"/>
                 <w:sz w:val="20"/>
               </w:rPr>
-              <w:t>on:</w:t>
+              <w:t xml:space="preserve">    EC2_HOST: ${{ secrets.EC2_HOST }}</w:t>
             </w:r>
           </w:p>
           <w:p>
@@ -6600,7 +6672,7 @@
                 <w:color w:val="D6E2EA"/>
                 <w:sz w:val="20"/>
               </w:rPr>
-              <w:t xml:space="preserve">  push:</w:t>
+              <w:t xml:space="preserve">    EC2_USER: ${{ secrets.EC2_USER }}</w:t>
             </w:r>
           </w:p>
           <w:p>
@@ -6613,7 +6685,7 @@
                 <w:color w:val="D6E2EA"/>
                 <w:sz w:val="20"/>
               </w:rPr>
-              <w:t xml:space="preserve">    branches: [ main ]</w:t>
+              <w:t xml:space="preserve">    EC2_SSH_KEY: ${{ secrets.EC2_SSH_KEY }}</w:t>
             </w:r>
           </w:p>
           <w:p>
@@ -6626,7 +6698,7 @@
                 <w:color w:val="D6E2EA"/>
                 <w:sz w:val="20"/>
               </w:rPr>
-              <w:t xml:space="preserve"> </w:t>
+              <w:t xml:space="preserve">  run: |</w:t>
             </w:r>
           </w:p>
           <w:p>
@@ -6639,7 +6711,7 @@
                 <w:color w:val="D6E2EA"/>
                 <w:sz w:val="20"/>
               </w:rPr>
-              <w:t>jobs:</w:t>
+              <w:t xml:space="preserve">    echo "$EC2_SSH_KEY" &gt; key.pem &amp;&amp; chmod 600 key.pem</w:t>
             </w:r>
           </w:p>
           <w:p>
@@ -6652,7 +6724,7 @@
                 <w:color w:val="D6E2EA"/>
                 <w:sz w:val="20"/>
               </w:rPr>
-              <w:t xml:space="preserve">  deploy:</w:t>
+              <w:t xml:space="preserve">    SCP="scp -i key.pem -o StrictHostKeyChecking=no"</w:t>
             </w:r>
           </w:p>
           <w:p>
@@ -6665,7 +6737,7 @@
                 <w:color w:val="D6E2EA"/>
                 <w:sz w:val="20"/>
               </w:rPr>
-              <w:t xml:space="preserve">    runs-on: ubuntu-latest</w:t>
+              <w:t xml:space="preserve"> </w:t>
             </w:r>
           </w:p>
           <w:p>
@@ -6675,10 +6747,10 @@
             <w:r>
               <w:rPr>
                 <w:rFonts w:ascii="Courier New" w:hAnsi="Courier New"/>
-                <w:color w:val="D6E2EA"/>
-                <w:sz w:val="20"/>
-              </w:rPr>
-              <w:t xml:space="preserve">    steps:</w:t>
+                <w:color w:val="7FB77E"/>
+                <w:sz w:val="20"/>
+              </w:rPr>
+              <w:t xml:space="preserve">    # 1. copy the built artifact to the box</w:t>
             </w:r>
           </w:p>
           <w:p>
@@ -6691,7 +6763,7 @@
                 <w:color w:val="D6E2EA"/>
                 <w:sz w:val="20"/>
               </w:rPr>
-              <w:t xml:space="preserve">      - uses: actions/checkout@v4</w:t>
+              <w:t xml:space="preserve">    $SCP backend.zip "$EC2_USER@$EC2_HOST:/tmp/backend.zip"</w:t>
             </w:r>
           </w:p>
           <w:p>
@@ -6704,7 +6776,7 @@
                 <w:color w:val="D6E2EA"/>
                 <w:sz w:val="20"/>
               </w:rPr>
-              <w:t xml:space="preserve">      - uses: actions/setup-node@v4</w:t>
+              <w:t xml:space="preserve"> </w:t>
             </w:r>
           </w:p>
           <w:p>
@@ -6714,10 +6786,10 @@
             <w:r>
               <w:rPr>
                 <w:rFonts w:ascii="Courier New" w:hAnsi="Courier New"/>
-                <w:color w:val="D6E2EA"/>
-                <w:sz w:val="20"/>
-              </w:rPr>
-              <w:t xml:space="preserve">        with: { node-version: 20 }</w:t>
+                <w:color w:val="7FB77E"/>
+                <w:sz w:val="20"/>
+              </w:rPr>
+              <w:t xml:space="preserve">    # 2. ONE ssh: pipe the remote release script in and run it as root</w:t>
             </w:r>
           </w:p>
           <w:p>
@@ -6730,7 +6802,7 @@
                 <w:color w:val="D6E2EA"/>
                 <w:sz w:val="20"/>
               </w:rPr>
-              <w:t xml:space="preserve">      - name: Build the artifact</w:t>
+              <w:t xml:space="preserve">    ssh -i key.pem -o StrictHostKeyChecking=no "$EC2_USER@$EC2_HOST" \</w:t>
             </w:r>
           </w:p>
           <w:p>
@@ -6743,7 +6815,7 @@
                 <w:color w:val="D6E2EA"/>
                 <w:sz w:val="20"/>
               </w:rPr>
-              <w:t xml:space="preserve">        working-directory: backend</w:t>
+              <w:t xml:space="preserve">        'sudo bash -s' &lt; deploy/deploy-backend-remote.sh</w:t>
             </w:r>
           </w:p>
           <w:p>
@@ -6756,7 +6828,7 @@
                 <w:color w:val="D6E2EA"/>
                 <w:sz w:val="20"/>
               </w:rPr>
-              <w:t xml:space="preserve">        run: |</w:t>
+              <w:t xml:space="preserve"> </w:t>
             </w:r>
           </w:p>
           <w:p>
@@ -6769,189 +6841,7 @@
                 <w:color w:val="D6E2EA"/>
                 <w:sz w:val="20"/>
               </w:rPr>
-              <w:t xml:space="preserve">          npm ci --omit=dev</w:t>
-            </w:r>
-          </w:p>
-          <w:p>
-            <w:pPr>
-              <w:spacing w:before="0" w:after="0" w:line="276" w:lineRule="auto"/>
-            </w:pPr>
-            <w:r>
-              <w:rPr>
-                <w:rFonts w:ascii="Courier New" w:hAnsi="Courier New"/>
-                <w:color w:val="D6E2EA"/>
-                <w:sz w:val="20"/>
-              </w:rPr>
-              <w:t xml:space="preserve">          zip -rq ../backend.zip . -x '*.env' 'tests/*'</w:t>
-            </w:r>
-          </w:p>
-          <w:p>
-            <w:pPr>
-              <w:spacing w:before="0" w:after="0" w:line="276" w:lineRule="auto"/>
-            </w:pPr>
-            <w:r>
-              <w:rPr>
-                <w:rFonts w:ascii="Courier New" w:hAnsi="Courier New"/>
-                <w:color w:val="D6E2EA"/>
-                <w:sz w:val="20"/>
-              </w:rPr>
-              <w:t xml:space="preserve">      - name: Write the SSH key</w:t>
-            </w:r>
-          </w:p>
-          <w:p>
-            <w:pPr>
-              <w:spacing w:before="0" w:after="0" w:line="276" w:lineRule="auto"/>
-            </w:pPr>
-            <w:r>
-              <w:rPr>
-                <w:rFonts w:ascii="Courier New" w:hAnsi="Courier New"/>
-                <w:color w:val="D6E2EA"/>
-                <w:sz w:val="20"/>
-              </w:rPr>
-              <w:t xml:space="preserve">        run: |</w:t>
-            </w:r>
-          </w:p>
-          <w:p>
-            <w:pPr>
-              <w:spacing w:before="0" w:after="0" w:line="276" w:lineRule="auto"/>
-            </w:pPr>
-            <w:r>
-              <w:rPr>
-                <w:rFonts w:ascii="Courier New" w:hAnsi="Courier New"/>
-                <w:color w:val="D6E2EA"/>
-                <w:sz w:val="20"/>
-              </w:rPr>
-              <w:t xml:space="preserve">          echo "${{ secrets.EC2_SSH_KEY }}" &gt; key.pem</w:t>
-            </w:r>
-          </w:p>
-          <w:p>
-            <w:pPr>
-              <w:spacing w:before="0" w:after="0" w:line="276" w:lineRule="auto"/>
-            </w:pPr>
-            <w:r>
-              <w:rPr>
-                <w:rFonts w:ascii="Courier New" w:hAnsi="Courier New"/>
-                <w:color w:val="D6E2EA"/>
-                <w:sz w:val="20"/>
-              </w:rPr>
-              <w:t xml:space="preserve">          chmod 400 key.pem</w:t>
-            </w:r>
-          </w:p>
-          <w:p>
-            <w:pPr>
-              <w:spacing w:before="0" w:after="0" w:line="276" w:lineRule="auto"/>
-            </w:pPr>
-            <w:r>
-              <w:rPr>
-                <w:rFonts w:ascii="Courier New" w:hAnsi="Courier New"/>
-                <w:color w:val="D6E2EA"/>
-                <w:sz w:val="20"/>
-              </w:rPr>
-              <w:t xml:space="preserve">      - name: Copy the artifact to the box</w:t>
-            </w:r>
-          </w:p>
-          <w:p>
-            <w:pPr>
-              <w:spacing w:before="0" w:after="0" w:line="276" w:lineRule="auto"/>
-            </w:pPr>
-            <w:r>
-              <w:rPr>
-                <w:rFonts w:ascii="Courier New" w:hAnsi="Courier New"/>
-                <w:color w:val="D6E2EA"/>
-                <w:sz w:val="20"/>
-              </w:rPr>
-              <w:t xml:space="preserve">        run: |</w:t>
-            </w:r>
-          </w:p>
-          <w:p>
-            <w:pPr>
-              <w:spacing w:before="0" w:after="0" w:line="276" w:lineRule="auto"/>
-            </w:pPr>
-            <w:r>
-              <w:rPr>
-                <w:rFonts w:ascii="Courier New" w:hAnsi="Courier New"/>
-                <w:color w:val="D6E2EA"/>
-                <w:sz w:val="20"/>
-              </w:rPr>
-              <w:t xml:space="preserve">          scp -o StrictHostKeyChecking=no -i key.pem backend.zip \</w:t>
-            </w:r>
-          </w:p>
-          <w:p>
-            <w:pPr>
-              <w:spacing w:before="0" w:after="0" w:line="276" w:lineRule="auto"/>
-            </w:pPr>
-            <w:r>
-              <w:rPr>
-                <w:rFonts w:ascii="Courier New" w:hAnsi="Courier New"/>
-                <w:color w:val="D6E2EA"/>
-                <w:sz w:val="20"/>
-              </w:rPr>
-              <w:t xml:space="preserve">            ${{ secrets.EC2_USER }}@${{ secrets.EC2_HOST }}:/tmp/backend.zip</w:t>
-            </w:r>
-          </w:p>
-          <w:p>
-            <w:pPr>
-              <w:spacing w:before="0" w:after="0" w:line="276" w:lineRule="auto"/>
-            </w:pPr>
-            <w:r>
-              <w:rPr>
-                <w:rFonts w:ascii="Courier New" w:hAnsi="Courier New"/>
-                <w:color w:val="D6E2EA"/>
-                <w:sz w:val="20"/>
-              </w:rPr>
-              <w:t xml:space="preserve">      - name: Release and restart (with rollback)</w:t>
-            </w:r>
-          </w:p>
-          <w:p>
-            <w:pPr>
-              <w:spacing w:before="0" w:after="0" w:line="276" w:lineRule="auto"/>
-            </w:pPr>
-            <w:r>
-              <w:rPr>
-                <w:rFonts w:ascii="Courier New" w:hAnsi="Courier New"/>
-                <w:color w:val="D6E2EA"/>
-                <w:sz w:val="20"/>
-              </w:rPr>
-              <w:t xml:space="preserve">        run: |</w:t>
-            </w:r>
-          </w:p>
-          <w:p>
-            <w:pPr>
-              <w:spacing w:before="0" w:after="0" w:line="276" w:lineRule="auto"/>
-            </w:pPr>
-            <w:r>
-              <w:rPr>
-                <w:rFonts w:ascii="Courier New" w:hAnsi="Courier New"/>
-                <w:color w:val="D6E2EA"/>
-                <w:sz w:val="20"/>
-              </w:rPr>
-              <w:t xml:space="preserve">          ssh -o StrictHostKeyChecking=no -i key.pem \</w:t>
-            </w:r>
-          </w:p>
-          <w:p>
-            <w:pPr>
-              <w:spacing w:before="0" w:after="0" w:line="276" w:lineRule="auto"/>
-            </w:pPr>
-            <w:r>
-              <w:rPr>
-                <w:rFonts w:ascii="Courier New" w:hAnsi="Courier New"/>
-                <w:color w:val="D6E2EA"/>
-                <w:sz w:val="20"/>
-              </w:rPr>
-              <w:t xml:space="preserve">            ${{ secrets.EC2_USER }}@${{ secrets.EC2_HOST }} \</w:t>
-            </w:r>
-          </w:p>
-          <w:p>
-            <w:pPr>
-              <w:spacing w:before="0" w:after="0" w:line="276" w:lineRule="auto"/>
-            </w:pPr>
-            <w:r>
-              <w:rPr>
-                <w:rFonts w:ascii="Courier New" w:hAnsi="Courier New"/>
-                <w:color w:val="D6E2EA"/>
-                <w:sz w:val="20"/>
-              </w:rPr>
-              <w:t xml:space="preserve">            'sudo bash -s' &lt; deploy/deploy-backend-remote.sh</w:t>
+              <w:t xml:space="preserve">    rm -f key.pem</w:t>
             </w:r>
           </w:p>
         </w:tc>
@@ -7011,7 +6901,7 @@
                 <w:color w:val="1B1B1B"/>
                 <w:sz w:val="20"/>
               </w:rPr>
-              <w:t>Never echo the key to the logs or commit key.pem — the workflow writes it on the runner at run time and the runner is destroyed afterwards. GitHub also masks the secret in any log line, so even an accidental echo shows as ***.</w:t>
+              <w:t>Notice there is exactly ONE ssh line. If you ever hand-type this and accidentally repeat the ssh line, the first ssh treats the second 'ssh' as the hostname and the deploy fails in a very confusing way. Using the file that ships with the app avoids that whole class of typo — which is the point of keeping pipelines in the repo.</w:t>
             </w:r>
           </w:p>
         </w:tc>
@@ -7025,69 +6915,6 @@
         <w:rPr>
           <w:sz w:val="6"/>
         </w:rPr>
-      </w:r>
-    </w:p>
-    <w:p>
-      <w:pPr>
-        <w:pStyle w:val="Heading3"/>
-      </w:pPr>
-      <w:r>
-        <w:t>D4 — What the remote script does, and why it can roll back</w:t>
-      </w:r>
-    </w:p>
-    <w:p>
-      <w:r>
-        <w:rPr>
-          <w:b w:val="0"/>
-          <w:i w:val="0"/>
-          <w:sz w:val="22"/>
-        </w:rPr>
-        <w:t>You do not have to write deploy-backend-remote.sh — it ships with the app — but you must understand it, because it is the part that makes a deploy safe. Open it and read it. In plain terms it does this:</w:t>
-      </w:r>
-    </w:p>
-    <w:p>
-      <w:pPr>
-        <w:pStyle w:val="ListNumber"/>
-        <w:spacing w:before="0" w:after="60"/>
-      </w:pPr>
-      <w:r>
-        <w:t>Unzip /tmp/backend.zip into a NEW folder named with the timestamp, e.g. releases/20261003-141200.</w:t>
-      </w:r>
-    </w:p>
-    <w:p>
-      <w:pPr>
-        <w:pStyle w:val="ListNumber"/>
-        <w:spacing w:before="0" w:after="60"/>
-      </w:pPr>
-      <w:r>
-        <w:t>Remember where the 'current' symlink points right now (the release that is live).</w:t>
-      </w:r>
-    </w:p>
-    <w:p>
-      <w:pPr>
-        <w:pStyle w:val="ListNumber"/>
-        <w:spacing w:before="0" w:after="60"/>
-      </w:pPr>
-      <w:r>
-        <w:t>Point 'current' at the new release and restart the service: systemctl restart paystream-api.</w:t>
-      </w:r>
-    </w:p>
-    <w:p>
-      <w:pPr>
-        <w:pStyle w:val="ListNumber"/>
-        <w:spacing w:before="0" w:after="60"/>
-      </w:pPr>
-      <w:r>
-        <w:t>Wait a few seconds, then curl http://localhost:3000/health on the box.</w:t>
-      </w:r>
-    </w:p>
-    <w:p>
-      <w:pPr>
-        <w:pStyle w:val="ListNumber"/>
-        <w:spacing w:before="0" w:after="60"/>
-      </w:pPr>
-      <w:r>
-        <w:t>If health answers ok, done. If it does NOT, point 'current' back at the previous release, restart again, and exit with an error so the pipeline shows red.</w:t>
       </w:r>
     </w:p>
     <w:tbl>
@@ -7134,7 +6961,7 @@
                 <w:color w:val="1B1B1B"/>
                 <w:sz w:val="20"/>
               </w:rPr>
-              <w:t>The symlink is the trick. 'current' is just a pointer; flipping it to a fully-unzipped new release is near-instant, and flipping it back is just as fast. That is why the rollback is automatic and quick: nothing is half-installed, the old release is still sitting there intact, and switching back is one pointer move.</w:t>
+              <w:t>The remote script is piped in over stdin and run with sudo, so it executes as root on the box. You pass it no arguments — it is self-contained (D4). Never echo the key to the logs or commit key.pem: the workflow writes it on the runner at run time, the runner is destroyed afterwards, and GitHub masks the secret so even an accidental echo shows as ***.</w:t>
             </w:r>
           </w:p>
         </w:tc>
@@ -7157,7 +6984,209 @@
           <w:i w:val="0"/>
           <w:sz w:val="22"/>
         </w:rPr>
-        <w:t>Add the matching frontend deploy as .github/workflows/deploy-frontend.yml — identical in shape, but it zips the frontend, copies it over, and runs deploy-frontend-remote.sh, which drops the files into /var/www/paystream and reloads Nginx. Both ship on every push to main.</w:t>
+        <w:t>To run it: push any change under backend/ to main, or trigger it by hand from the Actions tab (the workflow allows workflow_dispatch). The matching deploy-frontend.yml ships the frontend the same way.</w:t>
+      </w:r>
+    </w:p>
+    <w:p>
+      <w:pPr>
+        <w:pStyle w:val="Heading3"/>
+      </w:pPr>
+      <w:r>
+        <w:t>D4 — What the remote script does, and why it can roll back</w:t>
+      </w:r>
+    </w:p>
+    <w:p>
+      <w:r>
+        <w:rPr>
+          <w:b w:val="0"/>
+          <w:i w:val="0"/>
+          <w:sz w:val="22"/>
+        </w:rPr>
+        <w:t>You do not write deploy-backend-remote.sh — it ships with the app — but you must understand it, because it is the part that makes a deploy safe. Open it and read it. It is deliberately self-contained, so the workflow can pipe it in and run it with no arguments. In plain terms it does this:</w:t>
+      </w:r>
+    </w:p>
+    <w:p>
+      <w:pPr>
+        <w:pStyle w:val="ListNumber"/>
+        <w:spacing w:before="0" w:after="60"/>
+      </w:pPr>
+      <w:r>
+        <w:t>Make sure it is running as root (it re-elevates with sudo if it is not), so it can write under /opt and manage the service.</w:t>
+      </w:r>
+    </w:p>
+    <w:p>
+      <w:pPr>
+        <w:pStyle w:val="ListNumber"/>
+        <w:spacing w:before="0" w:after="60"/>
+      </w:pPr>
+      <w:r>
+        <w:t>Mint a release id from the current timestamp (e.g. 20261003-141200) — no argument needed — and unzip /tmp/backend.zip into a NEW folder, releases/&lt;that-id&gt;.</w:t>
+      </w:r>
+    </w:p>
+    <w:p>
+      <w:pPr>
+        <w:pStyle w:val="ListNumber"/>
+        <w:spacing w:before="0" w:after="60"/>
+      </w:pPr>
+      <w:r>
+        <w:t>Hand the new release to the 'paystream' service user (chown), so the service can read what it is about to run.</w:t>
+      </w:r>
+    </w:p>
+    <w:p>
+      <w:pPr>
+        <w:pStyle w:val="ListNumber"/>
+        <w:spacing w:before="0" w:after="60"/>
+      </w:pPr>
+      <w:r>
+        <w:t>Point the 'current' symlink at the new release and restart the service: systemctl restart paystream-api.</w:t>
+      </w:r>
+    </w:p>
+    <w:p>
+      <w:pPr>
+        <w:pStyle w:val="ListNumber"/>
+        <w:spacing w:before="0" w:after="60"/>
+      </w:pPr>
+      <w:r>
+        <w:t>Wait a few seconds, then curl http://localhost:3000/health on the box.</w:t>
+      </w:r>
+    </w:p>
+    <w:p>
+      <w:pPr>
+        <w:pStyle w:val="ListNumber"/>
+        <w:spacing w:before="0" w:after="60"/>
+      </w:pPr>
+      <w:r>
+        <w:t>If health answers ok, done, and it prunes old releases. If it does NOT, point 'current' back at the previous release, restart again, and exit with an error so the pipeline shows red.</w:t>
+      </w:r>
+    </w:p>
+    <w:tbl>
+      <w:tblPr>
+        <w:tblW w:type="auto" w:w="0"/>
+        <w:tblLook w:firstColumn="1" w:firstRow="1" w:lastColumn="0" w:lastRow="0" w:noHBand="0" w:noVBand="1" w:val="04A0"/>
+      </w:tblPr>
+      <w:tblGrid>
+        <w:gridCol w:w="9648"/>
+      </w:tblGrid>
+      <w:tr>
+        <w:tc>
+          <w:tcPr>
+            <w:tcW w:type="dxa" w:w="9648"/>
+            <w:shd w:val="clear" w:color="auto" w:fill="E0F2F1"/>
+            <w:tcBorders>
+              <w:top w:val="single" w:sz="8" w:color="00695C"/>
+              <w:left w:val="single" w:sz="8" w:color="00695C"/>
+              <w:bottom w:val="single" w:sz="8" w:color="00695C"/>
+              <w:right w:val="single" w:sz="8" w:color="00695C"/>
+            </w:tcBorders>
+            <w:tcMar>
+              <w:top w:w="110" w:type="dxa"/>
+              <w:start w:w="150" w:type="dxa"/>
+              <w:bottom w:w="110" w:type="dxa"/>
+              <w:end w:w="150" w:type="dxa"/>
+            </w:tcMar>
+          </w:tcPr>
+          <w:p>
+            <w:pPr>
+              <w:spacing w:before="0" w:after="20" w:line="276" w:lineRule="auto"/>
+            </w:pPr>
+            <w:r/>
+            <w:r>
+              <w:rPr>
+                <w:b/>
+                <w:color w:val="00695C"/>
+                <w:sz w:val="20"/>
+              </w:rPr>
+              <w:t xml:space="preserve">i Info </w:t>
+            </w:r>
+            <w:r>
+              <w:rPr>
+                <w:color w:val="1B1B1B"/>
+                <w:sz w:val="20"/>
+              </w:rPr>
+              <w:t>The symlink is the trick. 'current' is just a pointer; flipping it to a fully-unzipped new release is near-instant, and flipping it back is just as fast. That is why the rollback is automatic and quick: nothing is half-installed, the old release is still sitting there intact, and switching back is one pointer move.</w:t>
+            </w:r>
+          </w:p>
+        </w:tc>
+      </w:tr>
+    </w:tbl>
+    <w:p>
+      <w:pPr>
+        <w:spacing w:before="0" w:after="0"/>
+      </w:pPr>
+      <w:r>
+        <w:rPr>
+          <w:sz w:val="6"/>
+        </w:rPr>
+      </w:r>
+    </w:p>
+    <w:tbl>
+      <w:tblPr>
+        <w:tblW w:type="auto" w:w="0"/>
+        <w:tblLook w:firstColumn="1" w:firstRow="1" w:lastColumn="0" w:lastRow="0" w:noHBand="0" w:noVBand="1" w:val="04A0"/>
+      </w:tblPr>
+      <w:tblGrid>
+        <w:gridCol w:w="9648"/>
+      </w:tblGrid>
+      <w:tr>
+        <w:tc>
+          <w:tcPr>
+            <w:tcW w:type="dxa" w:w="9648"/>
+            <w:shd w:val="clear" w:color="auto" w:fill="FFF8E1"/>
+            <w:tcBorders>
+              <w:top w:val="single" w:sz="8" w:color="E65100"/>
+              <w:left w:val="single" w:sz="8" w:color="E65100"/>
+              <w:bottom w:val="single" w:sz="8" w:color="E65100"/>
+              <w:right w:val="single" w:sz="8" w:color="E65100"/>
+            </w:tcBorders>
+            <w:tcMar>
+              <w:top w:w="110" w:type="dxa"/>
+              <w:start w:w="150" w:type="dxa"/>
+              <w:bottom w:w="110" w:type="dxa"/>
+              <w:end w:w="150" w:type="dxa"/>
+            </w:tcMar>
+          </w:tcPr>
+          <w:p>
+            <w:pPr>
+              <w:spacing w:before="0" w:after="20" w:line="276" w:lineRule="auto"/>
+            </w:pPr>
+            <w:r/>
+            <w:r>
+              <w:rPr>
+                <w:b/>
+                <w:color w:val="E65100"/>
+                <w:sz w:val="20"/>
+              </w:rPr>
+              <w:t xml:space="preserve">⚠ Warning </w:t>
+            </w:r>
+            <w:r>
+              <w:rPr>
+                <w:color w:val="1B1B1B"/>
+                <w:sz w:val="20"/>
+              </w:rPr>
+              <w:t>Because the script mints its own release id, you must NOT pass one — the workflow pipes the script in with no arguments on purpose. An older version of this script demanded a release id as an argument and failed with 'usage: deploy-backend-remote.sh &lt;release-id&gt;' when none was given; the version that ships now does not. If you see that error, your repo has the old script — pull the latest.</w:t>
+            </w:r>
+          </w:p>
+        </w:tc>
+      </w:tr>
+    </w:tbl>
+    <w:p>
+      <w:pPr>
+        <w:spacing w:before="0" w:after="0"/>
+      </w:pPr>
+      <w:r>
+        <w:rPr>
+          <w:sz w:val="6"/>
+        </w:rPr>
+      </w:r>
+    </w:p>
+    <w:p>
+      <w:r>
+        <w:rPr>
+          <w:b w:val="0"/>
+          <w:i w:val="0"/>
+          <w:sz w:val="22"/>
+        </w:rPr>
+        <w:t>The matching frontend deploy, .github/workflows/deploy-frontend.yml, ships the frontend the same way: it zips the static files, copies them over, and runs deploy-frontend-remote.sh, which replaces the files in /var/www/paystream and reloads Nginx. Both ship on every push to main that touches their part of the app.</w:t>
       </w:r>
     </w:p>
     <w:p>

</xml_diff>